<commit_message>
cv update with mercor
</commit_message>
<xml_diff>
--- a/assets/work/cv/Xi_Lu_DS_CV.docx
+++ b/assets/work/cv/Xi_Lu_DS_CV.docx
@@ -430,15 +430,7 @@
         <w:spacing w:after="40"/>
       </w:pPr>
       <w:r>
-        <w:t xml:space="preserve">Programming: Python (Pandas, NumPy, scikit-learn), R, SQL, Shell, Git, </w:t>
-      </w:r>
-      <w:proofErr w:type="spellStart"/>
-      <w:r>
-        <w:t>Jupyter</w:t>
-      </w:r>
-      <w:proofErr w:type="spellEnd"/>
-      <w:r>
-        <w:t>, MATLAB</w:t>
+        <w:t>Programming: Python (Pandas, NumPy, scikit-learn), R, SQL, Shell, Git, Jupyter, MATLAB</w:t>
       </w:r>
     </w:p>
     <w:p>
@@ -594,7 +586,22 @@
           <w:b/>
           <w:bCs/>
         </w:rPr>
-        <w:t>xen Ltd</w:t>
+        <w:t>xen</w:t>
+      </w:r>
+      <w:r>
+        <w:rPr>
+          <w:b/>
+          <w:bCs/>
+          <w:vertAlign w:val="superscript"/>
+        </w:rPr>
+        <w:t>®</w:t>
+      </w:r>
+      <w:r>
+        <w:rPr>
+          <w:b/>
+          <w:bCs/>
+        </w:rPr>
+        <w:t xml:space="preserve"> Ltd</w:t>
       </w:r>
       <w:r>
         <w:rPr>
@@ -656,7 +663,16 @@
         <w:t>Lead Slo</w:t>
       </w:r>
       <w:r>
-        <w:t>xen Ltd</w:t>
+        <w:t>xen</w:t>
+      </w:r>
+      <w:r>
+        <w:rPr>
+          <w:vertAlign w:val="superscript"/>
+        </w:rPr>
+        <w:t>®</w:t>
+      </w:r>
+      <w:r>
+        <w:t xml:space="preserve"> Ltd</w:t>
       </w:r>
       <w:r>
         <w:t>, overseeing hybrid intelligence frameworks that combine data, machine learning, and expert judgment to produce actionable and trustworthy insights</w:t>
@@ -703,21 +719,77 @@
           <w:b/>
           <w:bCs/>
         </w:rPr>
-        <w:t>Research Fellow</w:t>
+        <w:t xml:space="preserve">Independent </w:t>
       </w:r>
       <w:r>
         <w:rPr>
           <w:b/>
           <w:bCs/>
         </w:rPr>
-        <w:t xml:space="preserve"> | </w:t>
+        <w:t>Contractor</w:t>
       </w:r>
       <w:r>
         <w:rPr>
           <w:b/>
           <w:bCs/>
         </w:rPr>
-        <w:t xml:space="preserve">Wellcome Sanger, Cambridge, UK (Apr 2024 </w:t>
+        <w:t xml:space="preserve"> </w:t>
+      </w:r>
+      <w:r>
+        <w:rPr>
+          <w:b/>
+          <w:bCs/>
+        </w:rPr>
+        <w:t>|</w:t>
+      </w:r>
+      <w:r>
+        <w:rPr>
+          <w:b/>
+          <w:bCs/>
+        </w:rPr>
+        <w:t xml:space="preserve"> </w:t>
+      </w:r>
+      <w:r>
+        <w:rPr>
+          <w:b/>
+          <w:bCs/>
+        </w:rPr>
+        <w:t>Mercor</w:t>
+      </w:r>
+      <w:r>
+        <w:rPr>
+          <w:b/>
+          <w:bCs/>
+        </w:rPr>
+        <w:t>, Cambridge, UK (</w:t>
+      </w:r>
+      <w:r>
+        <w:rPr>
+          <w:b/>
+          <w:bCs/>
+        </w:rPr>
+        <w:t>May</w:t>
+      </w:r>
+      <w:r>
+        <w:rPr>
+          <w:b/>
+          <w:bCs/>
+        </w:rPr>
+        <w:t xml:space="preserve"> 202</w:t>
+      </w:r>
+      <w:r>
+        <w:rPr>
+          <w:b/>
+          <w:bCs/>
+        </w:rPr>
+        <w:t>6</w:t>
+      </w:r>
+      <w:r>
+        <w:rPr>
+          <w:b/>
+          <w:bCs/>
+        </w:rPr>
+        <w:t xml:space="preserve"> </w:t>
       </w:r>
       <w:r>
         <w:rPr>
@@ -731,28 +803,7 @@
           <w:b/>
           <w:bCs/>
         </w:rPr>
-        <w:t xml:space="preserve"> </w:t>
-      </w:r>
-      <w:r>
-        <w:rPr>
-          <w:b/>
-          <w:bCs/>
-        </w:rPr>
-        <w:t>D</w:t>
-      </w:r>
-      <w:r>
-        <w:rPr>
-          <w:b/>
-          <w:bCs/>
-        </w:rPr>
-        <w:t>ec 2025</w:t>
-      </w:r>
-      <w:r>
-        <w:rPr>
-          <w:b/>
-          <w:bCs/>
-        </w:rPr>
-        <w:t>)</w:t>
+        <w:t xml:space="preserve"> Present)</w:t>
       </w:r>
     </w:p>
     <w:p>
@@ -762,15 +813,13 @@
         <w:ind w:left="360"/>
       </w:pPr>
       <w:r>
-        <w:t xml:space="preserve">Designed and automated ML pipelines for genomic cluster analysis using Python and </w:t>
-      </w:r>
-      <w:proofErr w:type="spellStart"/>
-      <w:r>
-        <w:t>Nextflow</w:t>
-      </w:r>
-      <w:proofErr w:type="spellEnd"/>
-      <w:r>
-        <w:t>, improving outbreak detection efficiency.</w:t>
+        <w:t xml:space="preserve">Validated AI-generated </w:t>
+      </w:r>
+      <w:r>
+        <w:t>data</w:t>
+      </w:r>
+      <w:r>
+        <w:t xml:space="preserve"> using project-specific review criteria.</w:t>
       </w:r>
     </w:p>
     <w:p>
@@ -780,17 +829,28 @@
         <w:ind w:left="360"/>
       </w:pPr>
       <w:r>
-        <w:t>Processed and standardised 20,000+ genomic datasets for global surveillance, ensuring data integrity and high-quality downstream analysis.</w:t>
-      </w:r>
-    </w:p>
-    <w:p>
-      <w:pPr>
-        <w:pStyle w:val="ListParagraph"/>
-        <w:spacing w:after="40"/>
-        <w:ind w:left="360"/>
-      </w:pPr>
-      <w:r>
-        <w:t>Collaborated with cross-functional engineering and data teams to curate and migrate biomedical data across cloud environments.</w:t>
+        <w:t>Maintained</w:t>
+      </w:r>
+      <w:r>
+        <w:t xml:space="preserve"> data quality </w:t>
+      </w:r>
+      <w:r>
+        <w:t>with</w:t>
+      </w:r>
+      <w:r>
+        <w:t xml:space="preserve"> consistent rubric standards</w:t>
+      </w:r>
+      <w:r>
+        <w:t xml:space="preserve"> </w:t>
+      </w:r>
+      <w:r>
+        <w:t xml:space="preserve">and project </w:t>
+      </w:r>
+      <w:r>
+        <w:t>automations</w:t>
+      </w:r>
+      <w:r>
+        <w:t>.</w:t>
       </w:r>
     </w:p>
     <w:p>
@@ -811,14 +871,28 @@
           <w:b/>
           <w:bCs/>
         </w:rPr>
-        <w:t>Research Associate</w:t>
+        <w:t>Research Fellow</w:t>
       </w:r>
       <w:r>
         <w:rPr>
           <w:b/>
           <w:bCs/>
         </w:rPr>
-        <w:t xml:space="preserve"> |</w:t>
+        <w:t xml:space="preserve"> | </w:t>
+      </w:r>
+      <w:r>
+        <w:rPr>
+          <w:b/>
+          <w:bCs/>
+        </w:rPr>
+        <w:t xml:space="preserve">Wellcome Sanger, Cambridge, UK (Apr 2024 </w:t>
+      </w:r>
+      <w:r>
+        <w:rPr>
+          <w:b/>
+          <w:bCs/>
+        </w:rPr>
+        <w:t>-</w:t>
       </w:r>
       <w:r>
         <w:rPr>
@@ -832,28 +906,21 @@
           <w:b/>
           <w:bCs/>
         </w:rPr>
-        <w:t xml:space="preserve">Imperial College London, London, UK </w:t>
+        <w:t>D</w:t>
       </w:r>
       <w:r>
         <w:rPr>
           <w:b/>
           <w:bCs/>
         </w:rPr>
-        <w:t xml:space="preserve">(Jun 2020 </w:t>
+        <w:t>ec 2025</w:t>
       </w:r>
       <w:r>
         <w:rPr>
           <w:b/>
           <w:bCs/>
         </w:rPr>
-        <w:t>-</w:t>
-      </w:r>
-      <w:r>
-        <w:rPr>
-          <w:b/>
-          <w:bCs/>
-        </w:rPr>
-        <w:t xml:space="preserve"> Dec 2023)</w:t>
+        <w:t>)</w:t>
       </w:r>
     </w:p>
     <w:p>
@@ -863,7 +930,15 @@
         <w:ind w:left="360"/>
       </w:pPr>
       <w:r>
-        <w:t>Developed a Bayesian ML framework to model genomic epidemiology and forecast infectious disease burdens across the UK.</w:t>
+        <w:t xml:space="preserve">Designed and automated ML pipelines for genomic cluster analysis using Python and </w:t>
+      </w:r>
+      <w:proofErr w:type="spellStart"/>
+      <w:r>
+        <w:t>Nextflow</w:t>
+      </w:r>
+      <w:proofErr w:type="spellEnd"/>
+      <w:r>
+        <w:t>, improving outbreak detection efficiency.</w:t>
       </w:r>
     </w:p>
     <w:p>
@@ -873,10 +948,7 @@
         <w:ind w:left="360"/>
       </w:pPr>
       <w:r>
-        <w:t>A</w:t>
-      </w:r>
-      <w:r>
-        <w:t>nalysed multi-country genomic datasets (&gt;100,000 records) to identify bacterial migration and resistance trends influencing vaccine design.</w:t>
+        <w:t>Processed and standardised 20,000+ genomic datasets for global surveillance, ensuring data integrity and high-quality downstream analysis.</w:t>
       </w:r>
     </w:p>
     <w:p>
@@ -886,17 +958,7 @@
         <w:ind w:left="360"/>
       </w:pPr>
       <w:r>
-        <w:t>Supervised 3 postgraduate projects in ML and data analytics; delivered teaching in statistics and applied machine learning.</w:t>
-      </w:r>
-    </w:p>
-    <w:p>
-      <w:pPr>
-        <w:pStyle w:val="ListParagraph"/>
-        <w:spacing w:after="40"/>
-        <w:ind w:left="360"/>
-      </w:pPr>
-      <w:r>
-        <w:t>Published conference papers and manuscripts on computational modelling and AI for public health applications.</w:t>
+        <w:t>Collaborated with cross-functional engineering and data teams to curate and migrate biomedical data across cloud environments.</w:t>
       </w:r>
     </w:p>
     <w:p>
@@ -917,28 +979,35 @@
           <w:b/>
           <w:bCs/>
         </w:rPr>
-        <w:t>Visiting Scholar</w:t>
+        <w:t>Research Associate</w:t>
       </w:r>
       <w:r>
         <w:rPr>
           <w:b/>
           <w:bCs/>
         </w:rPr>
-        <w:t xml:space="preserve"> | </w:t>
+        <w:t xml:space="preserve"> |</w:t>
       </w:r>
       <w:r>
         <w:rPr>
           <w:b/>
           <w:bCs/>
         </w:rPr>
-        <w:t>Tampere University, Tampere, Finland</w:t>
+        <w:t xml:space="preserve"> </w:t>
       </w:r>
       <w:r>
         <w:rPr>
           <w:b/>
           <w:bCs/>
         </w:rPr>
-        <w:t xml:space="preserve"> (Sep 2018 </w:t>
+        <w:t xml:space="preserve">Imperial College London, London, UK </w:t>
+      </w:r>
+      <w:r>
+        <w:rPr>
+          <w:b/>
+          <w:bCs/>
+        </w:rPr>
+        <w:t xml:space="preserve">(Jun 2020 </w:t>
       </w:r>
       <w:r>
         <w:rPr>
@@ -952,7 +1021,7 @@
           <w:b/>
           <w:bCs/>
         </w:rPr>
-        <w:t xml:space="preserve"> Dec 2018)</w:t>
+        <w:t xml:space="preserve"> Dec 2023)</w:t>
       </w:r>
     </w:p>
     <w:p>
@@ -962,7 +1031,40 @@
         <w:ind w:left="360"/>
       </w:pPr>
       <w:r>
-        <w:t>Conducted research on mission-aware systems and reliability modelling for next-generation 5G networks, producing 2 peer-reviewed publications.</w:t>
+        <w:t>Developed a Bayesian ML framework to model genomic epidemiology and forecast infectious disease burdens across the UK.</w:t>
+      </w:r>
+    </w:p>
+    <w:p>
+      <w:pPr>
+        <w:pStyle w:val="ListParagraph"/>
+        <w:spacing w:after="40"/>
+        <w:ind w:left="360"/>
+      </w:pPr>
+      <w:r>
+        <w:t>A</w:t>
+      </w:r>
+      <w:r>
+        <w:t>nalysed multi-country genomic datasets (&gt;100,000 records) to identify bacterial migration and resistance trends influencing vaccine design.</w:t>
+      </w:r>
+    </w:p>
+    <w:p>
+      <w:pPr>
+        <w:pStyle w:val="ListParagraph"/>
+        <w:spacing w:after="40"/>
+        <w:ind w:left="360"/>
+      </w:pPr>
+      <w:r>
+        <w:t>Supervised 3 postgraduate projects in ML and data analytics; delivered teaching in statistics and applied machine learning.</w:t>
+      </w:r>
+    </w:p>
+    <w:p>
+      <w:pPr>
+        <w:pStyle w:val="ListParagraph"/>
+        <w:spacing w:after="40"/>
+        <w:ind w:left="360"/>
+      </w:pPr>
+      <w:r>
+        <w:t>Published conference papers and manuscripts on computational modelling and AI for public health applications.</w:t>
       </w:r>
     </w:p>
     <w:p>
@@ -983,14 +1085,28 @@
           <w:b/>
           <w:bCs/>
         </w:rPr>
-        <w:t xml:space="preserve">Teaching Assistant | </w:t>
+        <w:t>Visiting Scholar</w:t>
       </w:r>
       <w:r>
         <w:rPr>
           <w:b/>
           <w:bCs/>
         </w:rPr>
-        <w:t xml:space="preserve">King’s College London, London, UK (Sep 2017 </w:t>
+        <w:t xml:space="preserve"> | </w:t>
+      </w:r>
+      <w:r>
+        <w:rPr>
+          <w:b/>
+          <w:bCs/>
+        </w:rPr>
+        <w:t>Tampere University, Tampere, Finland</w:t>
+      </w:r>
+      <w:r>
+        <w:rPr>
+          <w:b/>
+          <w:bCs/>
+        </w:rPr>
+        <w:t xml:space="preserve"> (Sep 2018 </w:t>
       </w:r>
       <w:r>
         <w:rPr>
@@ -1004,7 +1120,7 @@
           <w:b/>
           <w:bCs/>
         </w:rPr>
-        <w:t xml:space="preserve"> Jun 2019)</w:t>
+        <w:t xml:space="preserve"> Dec 2018)</w:t>
       </w:r>
     </w:p>
     <w:p>
@@ -1015,23 +1131,7 @@
       </w:pPr>
       <w:r>
         <w:lastRenderedPageBreak/>
-        <w:t>Delivered tutorials and marked coursework for modules in data structures, computing, and circuit theory (~300 students).</w:t>
-      </w:r>
-    </w:p>
-    <w:p>
-      <w:pPr>
-        <w:pStyle w:val="ListParagraph"/>
-        <w:spacing w:after="40"/>
-        <w:ind w:left="360"/>
-      </w:pPr>
-      <w:r>
-        <w:t xml:space="preserve">Supervised MSc projects applying ML to </w:t>
-      </w:r>
-      <w:r>
-        <w:t>optimise</w:t>
-      </w:r>
-      <w:r>
-        <w:t xml:space="preserve"> wireless network traffic.</w:t>
+        <w:t>Conducted research on mission-aware systems and reliability modelling for next-generation 5G networks, producing 2 peer-reviewed publications.</w:t>
       </w:r>
     </w:p>
     <w:p>
@@ -1052,6 +1152,74 @@
           <w:b/>
           <w:bCs/>
         </w:rPr>
+        <w:t xml:space="preserve">Teaching Assistant | </w:t>
+      </w:r>
+      <w:r>
+        <w:rPr>
+          <w:b/>
+          <w:bCs/>
+        </w:rPr>
+        <w:t xml:space="preserve">King’s College London, London, UK (Sep 2017 </w:t>
+      </w:r>
+      <w:r>
+        <w:rPr>
+          <w:b/>
+          <w:bCs/>
+        </w:rPr>
+        <w:t>-</w:t>
+      </w:r>
+      <w:r>
+        <w:rPr>
+          <w:b/>
+          <w:bCs/>
+        </w:rPr>
+        <w:t xml:space="preserve"> Jun 2019)</w:t>
+      </w:r>
+    </w:p>
+    <w:p>
+      <w:pPr>
+        <w:pStyle w:val="ListParagraph"/>
+        <w:spacing w:after="40"/>
+        <w:ind w:left="360"/>
+      </w:pPr>
+      <w:r>
+        <w:t>Delivered tutorials and marked coursework for modules in data structures, computing, and circuit theory (~300 students).</w:t>
+      </w:r>
+    </w:p>
+    <w:p>
+      <w:pPr>
+        <w:pStyle w:val="ListParagraph"/>
+        <w:spacing w:after="40"/>
+        <w:ind w:left="360"/>
+      </w:pPr>
+      <w:r>
+        <w:t xml:space="preserve">Supervised MSc projects applying ML to </w:t>
+      </w:r>
+      <w:r>
+        <w:t>optimise</w:t>
+      </w:r>
+      <w:r>
+        <w:t xml:space="preserve"> wireless network traffic.</w:t>
+      </w:r>
+    </w:p>
+    <w:p>
+      <w:pPr>
+        <w:pStyle w:val="ListParagraph"/>
+        <w:numPr>
+          <w:ilvl w:val="0"/>
+          <w:numId w:val="16"/>
+        </w:numPr>
+        <w:spacing w:before="120" w:after="0"/>
+        <w:rPr>
+          <w:b/>
+          <w:bCs/>
+        </w:rPr>
+      </w:pPr>
+      <w:r>
+        <w:rPr>
+          <w:b/>
+          <w:bCs/>
+        </w:rPr>
         <w:t>Independent Football Reporter</w:t>
       </w:r>
       <w:r>
@@ -1274,19 +1442,19 @@
         <w:spacing w:after="40"/>
       </w:pPr>
       <w:r>
-        <w:t xml:space="preserve">PhD, Telecommunications Research | King’s College London, UK (2015 </w:t>
+        <w:t>PhD, Telecom</w:t>
+      </w:r>
+      <w:r>
+        <w:t>.</w:t>
+      </w:r>
+      <w:r>
+        <w:t xml:space="preserve"> Research | King’s College London, UK (2015 </w:t>
       </w:r>
       <w:r>
         <w:t>-</w:t>
       </w:r>
       <w:r>
-        <w:t xml:space="preserve"> 2019) </w:t>
-      </w:r>
-      <w:r>
-        <w:t>-</w:t>
-      </w:r>
-      <w:r>
-        <w:t xml:space="preserve"> Thesis: 5G-U: Coexistence Framework for 5G Cellular and IEEE 802.11ad/ay</w:t>
+        <w:t xml:space="preserve"> 2019)</w:t>
       </w:r>
     </w:p>
     <w:p>
@@ -1299,7 +1467,19 @@
         <w:spacing w:after="40"/>
       </w:pPr>
       <w:r>
-        <w:t xml:space="preserve">MSc, Telecommunications and Internet Technology | King’s College London, UK (2013 </w:t>
+        <w:t>MSc, Telecom</w:t>
+      </w:r>
+      <w:r>
+        <w:t>.</w:t>
+      </w:r>
+      <w:r>
+        <w:t xml:space="preserve"> </w:t>
+      </w:r>
+      <w:r>
+        <w:t>&amp;</w:t>
+      </w:r>
+      <w:r>
+        <w:t xml:space="preserve"> Internet Technology | King’s College London, UK (2013 </w:t>
       </w:r>
       <w:r>
         <w:t>-</w:t>
@@ -1456,7 +1636,16 @@
         <w:spacing w:after="40"/>
       </w:pPr>
       <w:r>
-        <w:t>5G-U: Integrated Utilisation of Licensed and Unlicensed Spectrum, IEEE Communications Magazine, 2019</w:t>
+        <w:t>5G-U: Integrated Utilisation of Licensed and Unlicensed Spectrum, IEEE Comm</w:t>
+      </w:r>
+      <w:r>
+        <w:t>.</w:t>
+      </w:r>
+      <w:r>
+        <w:t xml:space="preserve"> </w:t>
+      </w:r>
+      <w:r>
+        <w:t>Magazine, 2019</w:t>
       </w:r>
     </w:p>
     <w:p>
@@ -1519,7 +1708,6 @@
         <w:t>, Prof Nicholas Croucher, Dr Stephanie Lo.</w:t>
       </w:r>
     </w:p>
-    <w:p/>
     <w:sectPr>
       <w:pgSz w:w="12240" w:h="15840"/>
       <w:pgMar w:top="1361" w:right="1797" w:bottom="1134" w:left="1797" w:header="720" w:footer="720" w:gutter="0"/>
@@ -3954,7 +4142,6 @@
   <w:style w:type="character" w:default="1" w:styleId="DefaultParagraphFont">
     <w:name w:val="Default Paragraph Font"/>
     <w:uiPriority w:val="1"/>
-    <w:semiHidden/>
     <w:unhideWhenUsed/>
   </w:style>
   <w:style w:type="table" w:default="1" w:styleId="TableNormal">

</xml_diff>